<commit_message>
fix(data): genericize client label, refresh docx
Tahr-Guardian card client 'Saudi conservation program' -> 'Gulf-region
conservation program' and regenerate the DOCX resume with the same
genericized project wording, matching the repo sanitization.

Co-Authored-By: Claude Opus 4.8 <noreply@anthropic.com>
</commit_message>
<xml_diff>
--- a/public/resume/Usama_Bin_Ejaz_Resume.docx
+++ b/public/resume/Usama_Bin_Ejaz_Resume.docx
@@ -1043,7 +1043,7 @@
           <w:sz w:val="21"/>
           <w:u w:val="none"/>
         </w:rPr>
-        <w:t>YOLOv8/v11 + CLIP pipeline detecting the Arabian Tahr and intruders for Saudi conservation; ~97% mAP@50 / ~94% recall.</w:t>
+        <w:t>YOLOv8/v11 + CLIP pipeline detecting the Arabian Tahr and intruders for a Gulf-region conservation program; ~97% mAP@50 / ~94% recall.</w:t>
       </w:r>
     </w:p>
     <w:p>
@@ -1089,7 +1089,7 @@
           <w:sz w:val="21"/>
           <w:u w:val="none"/>
         </w:rPr>
-        <w:t>Real-time vehicle detection, axle-based classification, and turning-movement counts on live California traffic cameras with automated TMC reports.</w:t>
+        <w:t>Real-time vehicle detection, axle-based classification, and turning-movement counts on live public traffic cameras with automated TMC reports.</w:t>
       </w:r>
     </w:p>
     <w:p>
@@ -1135,7 +1135,7 @@
           <w:sz w:val="21"/>
           <w:u w:val="none"/>
         </w:rPr>
-        <w:t>Geospatial YOLO + stereo-depth pipeline detecting 13+ road-damage classes and GPS-tagging each defect for a Netherlands municipality.</w:t>
+        <w:t>Geospatial YOLO + stereo-depth pipeline detecting 13+ road-damage classes and GPS-tagging each defect for a Dutch municipal road authority.</w:t>
       </w:r>
     </w:p>
     <w:p>

</xml_diff>

<commit_message>
feat(content): update employment history
Dellsons ended Apr 2026 (title normalized to Data Scientist); add
AiGenix (Data Scientist, Jun 2026) and a freelance umbrella entry
housing the client-project portfolio; refresh resume PDF/DOCX;
drop unused timeline.ts.

Co-Authored-By: Claude Opus 4.8 <noreply@anthropic.com>
</commit_message>
<xml_diff>
--- a/public/resume/Usama_Bin_Ejaz_Resume.docx
+++ b/public/resume/Usama_Bin_Ejaz_Resume.docx
@@ -331,7 +331,7 @@
           <w:sz w:val="21"/>
           <w:u w:val="none"/>
         </w:rPr>
-        <w:t>Dellsons Associates | Karachi, Pakistan</w:t>
+        <w:t>AiGenix | Karachi, Pakistan</w:t>
       </w:r>
       <w:r>
         <w:tab/>
@@ -344,7 +344,7 @@
           <w:sz w:val="21"/>
           <w:u w:val="none"/>
         </w:rPr>
-        <w:t>Oct 2025 - Present</w:t>
+        <w:t>Jun 2026 - Present</w:t>
       </w:r>
     </w:p>
     <w:p>
@@ -359,7 +359,7 @@
           <w:sz w:val="21"/>
           <w:u w:val="none"/>
         </w:rPr>
-        <w:t>Data Scientist (Lead)</w:t>
+        <w:t>Data Scientist</w:t>
       </w:r>
     </w:p>
     <w:p>
@@ -375,7 +375,7 @@
           <w:sz w:val="21"/>
           <w:u w:val="none"/>
         </w:rPr>
-        <w:t>Led AI/ML and data-science</w:t>
+        <w:t>Deliver client AI solutions with a computer-vision focus</w:t>
       </w:r>
       <w:r>
         <w:rPr>
@@ -385,7 +385,203 @@
           <w:sz w:val="21"/>
           <w:u w:val="none"/>
         </w:rPr>
-        <w:t xml:space="preserve"> delivery of 4 production systems across enterprise products.</w:t>
+        <w:t>, from model development through deployment.</w:t>
+      </w:r>
+    </w:p>
+    <w:p>
+      <w:pPr>
+        <w:pStyle w:val="ListBullet"/>
+        <w:spacing w:before="0" w:after="20" w:line="240" w:lineRule="auto"/>
+      </w:pPr>
+      <w:r>
+        <w:rPr>
+          <w:rFonts w:ascii="Calibri" w:hAnsi="Calibri" w:cs="Calibri"/>
+          <w:b/>
+          <w:i w:val="0"/>
+          <w:sz w:val="21"/>
+          <w:u w:val="none"/>
+        </w:rPr>
+        <w:t>Built a cross-platform mobile</w:t>
+      </w:r>
+      <w:r>
+        <w:rPr>
+          <w:rFonts w:ascii="Calibri" w:hAnsi="Calibri" w:cs="Calibri"/>
+          <w:b w:val="0"/>
+          <w:i w:val="0"/>
+          <w:sz w:val="21"/>
+          <w:u w:val="none"/>
+        </w:rPr>
+        <w:t xml:space="preserve"> app (iOS + Android) with a connected web portal for an AI-powered client solution.</w:t>
+      </w:r>
+    </w:p>
+    <w:p>
+      <w:pPr>
+        <w:tabs>
+          <w:tab w:pos="10800" w:val="right"/>
+        </w:tabs>
+        <w:spacing w:before="120" w:after="0" w:line="240" w:lineRule="auto"/>
+      </w:pPr>
+      <w:r>
+        <w:rPr>
+          <w:rFonts w:ascii="Calibri" w:hAnsi="Calibri" w:cs="Calibri"/>
+          <w:b/>
+          <w:i w:val="0"/>
+          <w:sz w:val="21"/>
+          <w:u w:val="none"/>
+        </w:rPr>
+        <w:t>Freelance AI/ML Engineer | Remote</w:t>
+      </w:r>
+      <w:r>
+        <w:tab/>
+      </w:r>
+      <w:r>
+        <w:rPr>
+          <w:rFonts w:ascii="Calibri" w:hAnsi="Calibri" w:cs="Calibri"/>
+          <w:b w:val="0"/>
+          <w:i/>
+          <w:sz w:val="21"/>
+          <w:u w:val="none"/>
+        </w:rPr>
+        <w:t>2022 - Present</w:t>
+      </w:r>
+    </w:p>
+    <w:p>
+      <w:pPr>
+        <w:spacing w:before="0" w:after="40" w:line="240" w:lineRule="auto"/>
+      </w:pPr>
+      <w:r>
+        <w:rPr>
+          <w:rFonts w:ascii="Calibri" w:hAnsi="Calibri" w:cs="Calibri"/>
+          <w:b/>
+          <w:i w:val="0"/>
+          <w:sz w:val="21"/>
+          <w:u w:val="none"/>
+        </w:rPr>
+        <w:t>Independent &amp; collaborative client projects</w:t>
+      </w:r>
+    </w:p>
+    <w:p>
+      <w:pPr>
+        <w:pStyle w:val="ListBullet"/>
+        <w:spacing w:before="0" w:after="20" w:line="240" w:lineRule="auto"/>
+      </w:pPr>
+      <w:r>
+        <w:rPr>
+          <w:rFonts w:ascii="Calibri" w:hAnsi="Calibri" w:cs="Calibri"/>
+          <w:b/>
+          <w:i w:val="0"/>
+          <w:sz w:val="21"/>
+          <w:u w:val="none"/>
+        </w:rPr>
+        <w:t>Deliver computer-vision and LLM</w:t>
+      </w:r>
+      <w:r>
+        <w:rPr>
+          <w:rFonts w:ascii="Calibri" w:hAnsi="Calibri" w:cs="Calibri"/>
+          <w:b w:val="0"/>
+          <w:i w:val="0"/>
+          <w:sz w:val="21"/>
+          <w:u w:val="none"/>
+        </w:rPr>
+        <w:t xml:space="preserve"> systems for international clients across conservation, infrastructure, logistics, and healthcare.</w:t>
+      </w:r>
+    </w:p>
+    <w:p>
+      <w:pPr>
+        <w:pStyle w:val="ListBullet"/>
+        <w:spacing w:before="0" w:after="20" w:line="240" w:lineRule="auto"/>
+      </w:pPr>
+      <w:r>
+        <w:rPr>
+          <w:rFonts w:ascii="Calibri" w:hAnsi="Calibri" w:cs="Calibri"/>
+          <w:b/>
+          <w:i w:val="0"/>
+          <w:sz w:val="21"/>
+          <w:u w:val="none"/>
+        </w:rPr>
+        <w:t>Highlights: endangered-species detection (~97% mAP@50)</w:t>
+      </w:r>
+      <w:r>
+        <w:rPr>
+          <w:rFonts w:ascii="Calibri" w:hAnsi="Calibri" w:cs="Calibri"/>
+          <w:b w:val="0"/>
+          <w:i w:val="0"/>
+          <w:sz w:val="21"/>
+          <w:u w:val="none"/>
+        </w:rPr>
+        <w:t>, geospatial road-damage detection for a Dutch municipal road authority, license-plate access control for an Amsterdam logistics warehouse, and a biomarker lab-report insights API.</w:t>
+      </w:r>
+    </w:p>
+    <w:p>
+      <w:pPr>
+        <w:tabs>
+          <w:tab w:pos="10800" w:val="right"/>
+        </w:tabs>
+        <w:spacing w:before="120" w:after="0" w:line="240" w:lineRule="auto"/>
+      </w:pPr>
+      <w:r>
+        <w:rPr>
+          <w:rFonts w:ascii="Calibri" w:hAnsi="Calibri" w:cs="Calibri"/>
+          <w:b/>
+          <w:i w:val="0"/>
+          <w:sz w:val="21"/>
+          <w:u w:val="none"/>
+        </w:rPr>
+        <w:t>Dellsons Associates | Karachi, Pakistan</w:t>
+      </w:r>
+      <w:r>
+        <w:tab/>
+      </w:r>
+      <w:r>
+        <w:rPr>
+          <w:rFonts w:ascii="Calibri" w:hAnsi="Calibri" w:cs="Calibri"/>
+          <w:b w:val="0"/>
+          <w:i/>
+          <w:sz w:val="21"/>
+          <w:u w:val="none"/>
+        </w:rPr>
+        <w:t>Oct 2025 - Apr 2026</w:t>
+      </w:r>
+    </w:p>
+    <w:p>
+      <w:pPr>
+        <w:spacing w:before="0" w:after="40" w:line="240" w:lineRule="auto"/>
+      </w:pPr>
+      <w:r>
+        <w:rPr>
+          <w:rFonts w:ascii="Calibri" w:hAnsi="Calibri" w:cs="Calibri"/>
+          <w:b/>
+          <w:i w:val="0"/>
+          <w:sz w:val="21"/>
+          <w:u w:val="none"/>
+        </w:rPr>
+        <w:t>Data Scientist</w:t>
+      </w:r>
+    </w:p>
+    <w:p>
+      <w:pPr>
+        <w:pStyle w:val="ListBullet"/>
+        <w:spacing w:before="0" w:after="20" w:line="240" w:lineRule="auto"/>
+      </w:pPr>
+      <w:r>
+        <w:rPr>
+          <w:rFonts w:ascii="Calibri" w:hAnsi="Calibri" w:cs="Calibri"/>
+          <w:b/>
+          <w:i w:val="0"/>
+          <w:sz w:val="21"/>
+          <w:u w:val="none"/>
+        </w:rPr>
+        <w:t>Led AI/ML delivery on</w:t>
+      </w:r>
+      <w:r>
+        <w:rPr>
+          <w:rFonts w:ascii="Calibri" w:hAnsi="Calibri" w:cs="Calibri"/>
+          <w:b w:val="0"/>
+          <w:i w:val="0"/>
+          <w:sz w:val="21"/>
+          <w:u w:val="none"/>
+        </w:rPr>
+        <w:t xml:space="preserve"> a compressed product roadmap - shipped 4 production systems in 7 months across enterprise products.</w:t>
       </w:r>
     </w:p>
     <w:p>

</xml_diff>

<commit_message>
feat(content): sharpen AiGenix experience bullets
Concrete shipped-product bullets from the project writeup (Play Store
launch, portal + API layer, LLM/vision integrations); refresh resume
files. App/product name kept out per confidentiality flags.

Co-Authored-By: Claude Opus 4.8 <noreply@anthropic.com>
</commit_message>
<xml_diff>
--- a/public/resume/Usama_Bin_Ejaz_Resume.docx
+++ b/public/resume/Usama_Bin_Ejaz_Resume.docx
@@ -375,7 +375,7 @@
           <w:sz w:val="21"/>
           <w:u w:val="none"/>
         </w:rPr>
-        <w:t>Deliver client AI solutions with a computer-vision focus</w:t>
+        <w:t>Built and shipped a</w:t>
       </w:r>
       <w:r>
         <w:rPr>
@@ -385,7 +385,7 @@
           <w:sz w:val="21"/>
           <w:u w:val="none"/>
         </w:rPr>
-        <w:t>, from model development through deployment.</w:t>
+        <w:t xml:space="preserve"> location-aware consumer mobile app (Expo/React Native, 5 cities, ~15 screens) to Google Play - iOS in App Store review - with an EAS build + OTA-update release pipeline.</w:t>
       </w:r>
     </w:p>
     <w:p>
@@ -401,7 +401,7 @@
           <w:sz w:val="21"/>
           <w:u w:val="none"/>
         </w:rPr>
-        <w:t>Built a cross-platform mobile</w:t>
+        <w:t>Shipped a bilingual (EN/AR</w:t>
       </w:r>
       <w:r>
         <w:rPr>
@@ -411,7 +411,33 @@
           <w:sz w:val="21"/>
           <w:u w:val="none"/>
         </w:rPr>
-        <w:t xml:space="preserve"> app (iOS + Android) with a connected web portal for an AI-powered client solution.</w:t>
+        <w:t>, RTL) Next.js merchant portal and a Supabase/Postgres API layer (~20 endpoints, JWT + Row-Level Security) powering QR redemptions and a tamper-resistant points ledger.</w:t>
+      </w:r>
+    </w:p>
+    <w:p>
+      <w:pPr>
+        <w:pStyle w:val="ListBullet"/>
+        <w:spacing w:before="0" w:after="20" w:line="240" w:lineRule="auto"/>
+      </w:pPr>
+      <w:r>
+        <w:rPr>
+          <w:rFonts w:ascii="Calibri" w:hAnsi="Calibri" w:cs="Calibri"/>
+          <w:b/>
+          <w:i w:val="0"/>
+          <w:sz w:val="21"/>
+          <w:u w:val="none"/>
+        </w:rPr>
+        <w:t>Integrated three LLM/vision features - a location-aware discovery assistant</w:t>
+      </w:r>
+      <w:r>
+        <w:rPr>
+          <w:rFonts w:ascii="Calibri" w:hAnsi="Calibri" w:cs="Calibri"/>
+          <w:b w:val="0"/>
+          <w:i w:val="0"/>
+          <w:sz w:val="21"/>
+          <w:u w:val="none"/>
+        </w:rPr>
+        <w:t>, poster-photo OCR auto-fill, and an LLM deal-extraction crawler - behind a swappable multi-provider abstraction.</w:t>
       </w:r>
     </w:p>
     <w:p>

</xml_diff>

<commit_message>
feat(content): add PerkMap, lead AiGenix with data science
Employer disclosure approved: PerkMap becomes project #22 (featured,
Data Science category). AiGenix bullets reframed DS-first (data
pipeline, LLM features, analytics; app/portal as delivery surfaces).
Add AI-assisted engineering to skills; stats 21->22, LLM systems 4.

Co-Authored-By: Claude Opus 4.8 <noreply@anthropic.com>
</commit_message>
<xml_diff>
--- a/public/resume/Usama_Bin_Ejaz_Resume.docx
+++ b/public/resume/Usama_Bin_Ejaz_Resume.docx
@@ -170,7 +170,7 @@
           <w:sz w:val="21"/>
           <w:u w:val="none"/>
         </w:rPr>
-        <w:t>OpenAI (GPT-4o), Gemini, Llama 3.2 Vision, Mistral 7B, LangGraph, LangChain, RAG, Pinecone, FAISS, prompt engineering, multi-agent orchestration</w:t>
+        <w:t>OpenAI (GPT-4o), Gemini, Llama 3.2 Vision, Mistral 7B, LangGraph, LangChain, RAG, Pinecone, FAISS, prompt engineering, multi-agent orchestration, AI-assisted engineering (Claude Code, Cursor)</w:t>
       </w:r>
     </w:p>
     <w:p>
@@ -375,7 +375,7 @@
           <w:sz w:val="21"/>
           <w:u w:val="none"/>
         </w:rPr>
-        <w:t>Built and shipped a</w:t>
+        <w:t>Own the data value chain of PerkMap</w:t>
       </w:r>
       <w:r>
         <w:rPr>
@@ -385,7 +385,7 @@
           <w:sz w:val="21"/>
           <w:u w:val="none"/>
         </w:rPr>
-        <w:t xml:space="preserve"> location-aware consumer mobile app (Expo/React Native, 5 cities, ~15 screens) to Google Play - iOS in App Store review - with an EAS build + OTA-update release pipeline.</w:t>
+        <w:t>, a geospatial perks-discovery platform: built a crawling + LLM-extraction pipeline converting unstructured promo pages into a deduplicated (fuzzy-matched), geocoded deals catalogue with per-day cost gating.</w:t>
       </w:r>
     </w:p>
     <w:p>
@@ -401,7 +401,7 @@
           <w:sz w:val="21"/>
           <w:u w:val="none"/>
         </w:rPr>
-        <w:t>Shipped a bilingual (EN/AR</w:t>
+        <w:t>Designed the intelligent features:</w:t>
       </w:r>
       <w:r>
         <w:rPr>
@@ -411,7 +411,7 @@
           <w:sz w:val="21"/>
           <w:u w:val="none"/>
         </w:rPr>
-        <w:t>, RTL) Next.js merchant portal and a Supabase/Postgres API layer (~20 endpoints, JWT + Row-Level Security) powering QR redemptions and a tamper-resistant points ledger.</w:t>
+        <w:t xml:space="preserve"> a location-aware GPT discovery assistant (structured JSON outputs + web search) and multimodal poster-OCR auto-fill, behind a swappable multi-provider LLM abstraction.</w:t>
       </w:r>
     </w:p>
     <w:p>
@@ -427,7 +427,7 @@
           <w:sz w:val="21"/>
           <w:u w:val="none"/>
         </w:rPr>
-        <w:t>Integrated three LLM/vision features - a location-aware discovery assistant</w:t>
+        <w:t>Built merchant analytics: audience</w:t>
       </w:r>
       <w:r>
         <w:rPr>
@@ -437,7 +437,33 @@
           <w:sz w:val="21"/>
           <w:u w:val="none"/>
         </w:rPr>
-        <w:t>, poster-photo OCR auto-fill, and an LLM deal-extraction crawler - behind a swappable multi-provider abstraction.</w:t>
+        <w:t xml:space="preserve"> dashboards and a privacy-preserving geospatial activity heatmap with consent gating and small-cohort suppression (no counts below 3 users).</w:t>
+      </w:r>
+    </w:p>
+    <w:p>
+      <w:pPr>
+        <w:pStyle w:val="ListBullet"/>
+        <w:spacing w:before="0" w:after="20" w:line="240" w:lineRule="auto"/>
+      </w:pPr>
+      <w:r>
+        <w:rPr>
+          <w:rFonts w:ascii="Calibri" w:hAnsi="Calibri" w:cs="Calibri"/>
+          <w:b/>
+          <w:i w:val="0"/>
+          <w:sz w:val="21"/>
+          <w:u w:val="none"/>
+        </w:rPr>
+        <w:t>Shipped the delivery surfaces</w:t>
+      </w:r>
+      <w:r>
+        <w:rPr>
+          <w:rFonts w:ascii="Calibri" w:hAnsi="Calibri" w:cs="Calibri"/>
+          <w:b w:val="0"/>
+          <w:i w:val="0"/>
+          <w:sz w:val="21"/>
+          <w:u w:val="none"/>
+        </w:rPr>
+        <w:t xml:space="preserve"> end-to-end: a 5-city consumer app (Expo/React Native, live on Google Play; iOS in review) and a bilingual (EN/AR) merchant portal on a Supabase/Postgres API with JWT + Row-Level Security.</w:t>
       </w:r>
     </w:p>
     <w:p>

</xml_diff>

<commit_message>
fix(content): iOS live, de-dash experience copy
PerkMap approved on the App Store; genericize punctuation in
experience and card copy per style preference; refresh resume files.

Co-Authored-By: Claude Opus 4.8 <noreply@anthropic.com>
</commit_message>
<xml_diff>
--- a/public/resume/Usama_Bin_Ejaz_Resume.docx
+++ b/public/resume/Usama_Bin_Ejaz_Resume.docx
@@ -463,7 +463,7 @@
           <w:sz w:val="21"/>
           <w:u w:val="none"/>
         </w:rPr>
-        <w:t xml:space="preserve"> end-to-end: a 5-city consumer app (Expo/React Native, live on Google Play; iOS in review) and a bilingual (EN/AR) merchant portal on a Supabase/Postgres API with JWT + Row-Level Security.</w:t>
+        <w:t xml:space="preserve"> end to end: a 5-city consumer app (Expo/React Native, live on Google Play and the App Store) and a bilingual (EN/AR) merchant portal on a Supabase/Postgres API with JWT + Row-Level Security.</w:t>
       </w:r>
     </w:p>
     <w:p>
@@ -633,7 +633,7 @@
           <w:sz w:val="21"/>
           <w:u w:val="none"/>
         </w:rPr>
-        <w:t xml:space="preserve"> a compressed product roadmap - shipped 4 production systems in 7 months across enterprise products.</w:t>
+        <w:t xml:space="preserve"> a compressed product roadmap: shipped 4 production systems in 7 months across enterprise products.</w:t>
       </w:r>
     </w:p>
     <w:p>

</xml_diff>